<commit_message>
Añade Actividad 6.3 completa, diapositivas de contenedores gestionados y Tema 7 (teoría y Actividad 7.1)
- Actividad 6.3: explicaciones del "por qué" en cada comando de Docker/ECR/ECS, aviso de captura con identificador, corrección de la numeración de revisiones de la definición de tarea, limpieza de notas de "captura de referencia del profesor".
- Diapositivas de "Contenedores gestionados" (16 diapositivas, con los diagramas reales del apartado).
- Correcciones en la teoría de contenedores gestionados: diagrama de las piezas del servicio, explicación de Fargate frente a instancias propias.
- Tema 7 completo: teoría "Well-Architected: los seis pilares" y Actividad 7.1 "Auditoría y mejora", con sus plantillas.
- Aviso "Cómo hacer las capturas" (identificador visible) añadido a las 16 actividades del curso.
- Corrección de nota obsoleta en la Actividad 3.2.
</commit_message>
<xml_diff>
--- a/docs/tema6/plantillas/Actividad_6_3_INU_Plantilla.docx
+++ b/docs/tema6/plantillas/Actividad_6_3_INU_Plantilla.docx
@@ -167,7 +167,7 @@
                 <w:sz w:val="20"/>
                 <w:szCs w:val="20"/>
               </w:rPr>
-              <w:t xml:space="preserve">Identificador de recursos usado (ej. contador-asistencia-&lt;tu-identificador&gt;): _______________________</w:t>
+              <w:t xml:space="preserve">Identificador de recursos (el tuyo): ______________________________________________</w:t>
             </w:r>
           </w:p>
         </w:tc>
@@ -198,7 +198,7 @@
           <w:sz w:val="26"/>
           <w:szCs w:val="26"/>
         </w:rPr>
-        <w:t xml:space="preserve">Parte A — Publica y despliega</w:t>
+        <w:t xml:space="preserve">Parte A — De la imagen al servicio</w:t>
       </w:r>
     </w:p>
     <w:p>
@@ -222,7 +222,7 @@
           <w:sz w:val="24"/>
           <w:szCs w:val="24"/>
         </w:rPr>
-        <w:t xml:space="preserve">Paso 1 — Crea el registro y publica la imagen</w:t>
+        <w:t xml:space="preserve">Paso 1 — Construye y prueba la imagen en CloudShell</w:t>
       </w:r>
     </w:p>
     <w:tbl>
@@ -268,7 +268,7 @@
                 <w:sz w:val="20"/>
                 <w:szCs w:val="20"/>
               </w:rPr>
-              <w:t xml:space="preserve">📸 Repositorio ECR creado, con el botón de comandos de inserción, y la imagen subida con su etiqueta de versión</w:t>
+              <w:t xml:space="preserve">📸 La salida de docker build con su final, y la del curl a la aplicación</w:t>
             </w:r>
           </w:p>
         </w:tc>
@@ -315,7 +315,7 @@
     </w:tbl>
     <w:p>
       <w:pPr>
-        <w:spacing w:after="200"/>
+        <w:spacing w:after="160"/>
       </w:pPr>
     </w:p>
     <w:p>
@@ -334,7 +334,21 @@
           <w:sz w:val="24"/>
           <w:szCs w:val="24"/>
         </w:rPr>
-        <w:t xml:space="preserve">Paso 2 — Despliega el servicio desde la consola</w:t>
+        <w:t xml:space="preserve">Reflexiona (Paso 1)</w:t>
+      </w:r>
+    </w:p>
+    <w:p>
+      <w:pPr>
+        <w:spacing w:after="100"/>
+      </w:pPr>
+      <w:r>
+        <w:rPr>
+          <w:rFonts w:ascii="Arial" w:cs="Arial" w:eastAsia="Arial" w:hAnsi="Arial"/>
+          <w:color w:val="212121"/>
+          <w:sz w:val="22"/>
+          <w:szCs w:val="22"/>
+        </w:rPr>
+        <w:t xml:space="preserve">¿Funcionaría la imagen igual en una instancia o en un servicio gestionado? ¿Qué tendría que tener instalado esa máquina, además de un sistema que ejecute contenedores?</w:t>
       </w:r>
     </w:p>
     <w:tbl>
@@ -353,41 +367,8 @@
         <w:gridCol w:w="9638"/>
       </w:tblGrid>
       <w:tr>
-        <w:tc>
-          <w:tcPr>
-            <w:tcW w:type="dxa" w:w="9638"/>
-            <w:tcBorders>
-              <w:top w:val="none" w:color="FFFFFF" w:sz="0"/>
-              <w:left w:val="none" w:color="FFFFFF" w:sz="0"/>
-              <w:bottom w:val="none" w:color="FFFFFF" w:sz="0"/>
-              <w:right w:val="none" w:color="FFFFFF" w:sz="0"/>
-            </w:tcBorders>
-            <w:shd w:fill="3949AB" w:val="clear"/>
-            <w:tcMar>
-              <w:top w:type="dxa" w:w="80"/>
-              <w:left w:type="dxa" w:w="160"/>
-              <w:bottom w:type="dxa" w:w="80"/>
-              <w:right w:type="dxa" w:w="160"/>
-            </w:tcMar>
-          </w:tcPr>
-          <w:p>
-            <w:r>
-              <w:rPr>
-                <w:rFonts w:ascii="Arial" w:cs="Arial" w:eastAsia="Arial" w:hAnsi="Arial"/>
-                <w:b/>
-                <w:bCs/>
-                <w:color w:val="FFFFFF"/>
-                <w:sz w:val="20"/>
-                <w:szCs w:val="20"/>
-              </w:rPr>
-              <w:t xml:space="preserve">📸 Servicio ECS creado, con la tarea en estado running, y el contador respondiendo en el navegador</w:t>
-            </w:r>
-          </w:p>
-        </w:tc>
-      </w:tr>
-      <w:tr>
-        <w:trPr>
-          <w:trHeight w:val="2400"/>
+        <w:trPr>
+          <w:trHeight w:val="480"/>
         </w:trPr>
         <w:tc>
           <w:tcPr>
@@ -400,26 +381,115 @@
             </w:tcBorders>
             <w:shd w:fill="FAFAFA" w:val="clear"/>
             <w:tcMar>
-              <w:top w:type="dxa" w:w="80"/>
-              <w:left w:type="dxa" w:w="160"/>
-              <w:bottom w:type="dxa" w:w="80"/>
-              <w:right w:type="dxa" w:w="160"/>
-            </w:tcMar>
-          </w:tcPr>
-          <w:p>
-            <w:pPr>
-              <w:jc w:val="center"/>
-            </w:pPr>
-            <w:r>
-              <w:rPr>
-                <w:rFonts w:ascii="Arial" w:cs="Arial" w:eastAsia="Arial" w:hAnsi="Arial"/>
-                <w:i/>
-                <w:iCs/>
-                <w:color w:val="757575"/>
-                <w:sz w:val="20"/>
-                <w:szCs w:val="20"/>
-              </w:rPr>
-              <w:t xml:space="preserve">[Pega aquí la captura de pantalla]</w:t>
+              <w:top w:type="dxa" w:w="60"/>
+              <w:left w:type="dxa" w:w="160"/>
+              <w:bottom w:type="dxa" w:w="60"/>
+              <w:right w:type="dxa" w:w="160"/>
+            </w:tcMar>
+          </w:tcPr>
+          <w:p>
+            <w:r>
+              <w:rPr>
+                <w:sz w:val="22"/>
+                <w:szCs w:val="22"/>
+              </w:rPr>
+              <w:t xml:space="preserve"/>
+            </w:r>
+          </w:p>
+        </w:tc>
+      </w:tr>
+      <w:tr>
+        <w:trPr>
+          <w:trHeight w:val="480"/>
+        </w:trPr>
+        <w:tc>
+          <w:tcPr>
+            <w:tcW w:type="dxa" w:w="9638"/>
+            <w:tcBorders>
+              <w:top w:val="single" w:color="E0E0E0" w:sz="4"/>
+              <w:left w:val="single" w:color="E0E0E0" w:sz="4"/>
+              <w:bottom w:val="single" w:color="E0E0E0" w:sz="4"/>
+              <w:right w:val="single" w:color="E0E0E0" w:sz="4"/>
+            </w:tcBorders>
+            <w:shd w:fill="FAFAFA" w:val="clear"/>
+            <w:tcMar>
+              <w:top w:type="dxa" w:w="60"/>
+              <w:left w:type="dxa" w:w="160"/>
+              <w:bottom w:type="dxa" w:w="60"/>
+              <w:right w:type="dxa" w:w="160"/>
+            </w:tcMar>
+          </w:tcPr>
+          <w:p>
+            <w:r>
+              <w:rPr>
+                <w:sz w:val="22"/>
+                <w:szCs w:val="22"/>
+              </w:rPr>
+              <w:t xml:space="preserve"/>
+            </w:r>
+          </w:p>
+        </w:tc>
+      </w:tr>
+      <w:tr>
+        <w:trPr>
+          <w:trHeight w:val="480"/>
+        </w:trPr>
+        <w:tc>
+          <w:tcPr>
+            <w:tcW w:type="dxa" w:w="9638"/>
+            <w:tcBorders>
+              <w:top w:val="single" w:color="E0E0E0" w:sz="4"/>
+              <w:left w:val="single" w:color="E0E0E0" w:sz="4"/>
+              <w:bottom w:val="single" w:color="E0E0E0" w:sz="4"/>
+              <w:right w:val="single" w:color="E0E0E0" w:sz="4"/>
+            </w:tcBorders>
+            <w:shd w:fill="FAFAFA" w:val="clear"/>
+            <w:tcMar>
+              <w:top w:type="dxa" w:w="60"/>
+              <w:left w:type="dxa" w:w="160"/>
+              <w:bottom w:type="dxa" w:w="60"/>
+              <w:right w:type="dxa" w:w="160"/>
+            </w:tcMar>
+          </w:tcPr>
+          <w:p>
+            <w:r>
+              <w:rPr>
+                <w:sz w:val="22"/>
+                <w:szCs w:val="22"/>
+              </w:rPr>
+              <w:t xml:space="preserve"/>
+            </w:r>
+          </w:p>
+        </w:tc>
+      </w:tr>
+      <w:tr>
+        <w:trPr>
+          <w:trHeight w:val="480"/>
+        </w:trPr>
+        <w:tc>
+          <w:tcPr>
+            <w:tcW w:type="dxa" w:w="9638"/>
+            <w:tcBorders>
+              <w:top w:val="single" w:color="E0E0E0" w:sz="4"/>
+              <w:left w:val="single" w:color="E0E0E0" w:sz="4"/>
+              <w:bottom w:val="single" w:color="E0E0E0" w:sz="4"/>
+              <w:right w:val="single" w:color="E0E0E0" w:sz="4"/>
+            </w:tcBorders>
+            <w:shd w:fill="FAFAFA" w:val="clear"/>
+            <w:tcMar>
+              <w:top w:type="dxa" w:w="60"/>
+              <w:left w:type="dxa" w:w="160"/>
+              <w:bottom w:type="dxa" w:w="60"/>
+              <w:right w:type="dxa" w:w="160"/>
+            </w:tcMar>
+          </w:tcPr>
+          <w:p>
+            <w:r>
+              <w:rPr>
+                <w:sz w:val="22"/>
+                <w:szCs w:val="22"/>
+              </w:rPr>
+              <w:t xml:space="preserve"/>
             </w:r>
           </w:p>
         </w:tc>
@@ -427,8 +497,13 @@
     </w:tbl>
     <w:p>
       <w:pPr>
-        <w:spacing w:after="160"/>
-      </w:pPr>
+        <w:spacing w:after="200"/>
+      </w:pPr>
+    </w:p>
+    <w:p>
+      <w:r>
+        <w:br w:type="page"/>
+      </w:r>
     </w:p>
     <w:p>
       <w:pPr>
@@ -446,21 +521,7 @@
           <w:sz w:val="24"/>
           <w:szCs w:val="24"/>
         </w:rPr>
-        <w:t xml:space="preserve">Reflexiona</w:t>
-      </w:r>
-    </w:p>
-    <w:p>
-      <w:pPr>
-        <w:spacing w:after="100"/>
-      </w:pPr>
-      <w:r>
-        <w:rPr>
-          <w:rFonts w:ascii="Arial" w:cs="Arial" w:eastAsia="Arial" w:hAnsi="Arial"/>
-          <w:color w:val="212121"/>
-          <w:sz w:val="22"/>
-          <w:szCs w:val="22"/>
-        </w:rPr>
-        <w:t xml:space="preserve">No has tocado ningún sistema operativo, ni elegido un tipo de instancia, para llegar hasta aquí. ¿Qué parte exacta de lo que implicaría gestionar tú mismo una instancia EC2 ha desaparecido de tu responsabilidad, y qué parte sigue siendo tuya (la definición de tarea, el código de la imagen)?</w:t>
+        <w:t xml:space="preserve">Paso 2 — Guarda la imagen en el registro (ECR)</w:t>
       </w:r>
     </w:p>
     <w:tbl>
@@ -479,8 +540,41 @@
         <w:gridCol w:w="9638"/>
       </w:tblGrid>
       <w:tr>
-        <w:trPr>
-          <w:trHeight w:val="480"/>
+        <w:tc>
+          <w:tcPr>
+            <w:tcW w:type="dxa" w:w="9638"/>
+            <w:tcBorders>
+              <w:top w:val="none" w:color="FFFFFF" w:sz="0"/>
+              <w:left w:val="none" w:color="FFFFFF" w:sz="0"/>
+              <w:bottom w:val="none" w:color="FFFFFF" w:sz="0"/>
+              <w:right w:val="none" w:color="FFFFFF" w:sz="0"/>
+            </w:tcBorders>
+            <w:shd w:fill="3949AB" w:val="clear"/>
+            <w:tcMar>
+              <w:top w:type="dxa" w:w="80"/>
+              <w:left w:type="dxa" w:w="160"/>
+              <w:bottom w:type="dxa" w:w="80"/>
+              <w:right w:type="dxa" w:w="160"/>
+            </w:tcMar>
+          </w:tcPr>
+          <w:p>
+            <w:r>
+              <w:rPr>
+                <w:rFonts w:ascii="Arial" w:cs="Arial" w:eastAsia="Arial" w:hAnsi="Arial"/>
+                <w:b/>
+                <w:bCs/>
+                <w:color w:val="FFFFFF"/>
+                <w:sz w:val="20"/>
+                <w:szCs w:val="20"/>
+              </w:rPr>
+              <w:t xml:space="preserve">📸 Tu repositorio en ECR con la imagen v1 visible</w:t>
+            </w:r>
+          </w:p>
+        </w:tc>
+      </w:tr>
+      <w:tr>
+        <w:trPr>
+          <w:trHeight w:val="2400"/>
         </w:trPr>
         <w:tc>
           <w:tcPr>
@@ -493,147 +587,26 @@
             </w:tcBorders>
             <w:shd w:fill="FAFAFA" w:val="clear"/>
             <w:tcMar>
-              <w:top w:type="dxa" w:w="60"/>
-              <w:left w:type="dxa" w:w="160"/>
-              <w:bottom w:type="dxa" w:w="60"/>
-              <w:right w:type="dxa" w:w="160"/>
-            </w:tcMar>
-          </w:tcPr>
-          <w:p>
-            <w:r>
-              <w:rPr>
-                <w:sz w:val="22"/>
-                <w:szCs w:val="22"/>
-              </w:rPr>
-              <w:t xml:space="preserve"/>
-            </w:r>
-          </w:p>
-        </w:tc>
-      </w:tr>
-      <w:tr>
-        <w:trPr>
-          <w:trHeight w:val="480"/>
-        </w:trPr>
-        <w:tc>
-          <w:tcPr>
-            <w:tcW w:type="dxa" w:w="9638"/>
-            <w:tcBorders>
-              <w:top w:val="single" w:color="E0E0E0" w:sz="4"/>
-              <w:left w:val="single" w:color="E0E0E0" w:sz="4"/>
-              <w:bottom w:val="single" w:color="E0E0E0" w:sz="4"/>
-              <w:right w:val="single" w:color="E0E0E0" w:sz="4"/>
-            </w:tcBorders>
-            <w:shd w:fill="FAFAFA" w:val="clear"/>
-            <w:tcMar>
-              <w:top w:type="dxa" w:w="60"/>
-              <w:left w:type="dxa" w:w="160"/>
-              <w:bottom w:type="dxa" w:w="60"/>
-              <w:right w:type="dxa" w:w="160"/>
-            </w:tcMar>
-          </w:tcPr>
-          <w:p>
-            <w:r>
-              <w:rPr>
-                <w:sz w:val="22"/>
-                <w:szCs w:val="22"/>
-              </w:rPr>
-              <w:t xml:space="preserve"/>
-            </w:r>
-          </w:p>
-        </w:tc>
-      </w:tr>
-      <w:tr>
-        <w:trPr>
-          <w:trHeight w:val="480"/>
-        </w:trPr>
-        <w:tc>
-          <w:tcPr>
-            <w:tcW w:type="dxa" w:w="9638"/>
-            <w:tcBorders>
-              <w:top w:val="single" w:color="E0E0E0" w:sz="4"/>
-              <w:left w:val="single" w:color="E0E0E0" w:sz="4"/>
-              <w:bottom w:val="single" w:color="E0E0E0" w:sz="4"/>
-              <w:right w:val="single" w:color="E0E0E0" w:sz="4"/>
-            </w:tcBorders>
-            <w:shd w:fill="FAFAFA" w:val="clear"/>
-            <w:tcMar>
-              <w:top w:type="dxa" w:w="60"/>
-              <w:left w:type="dxa" w:w="160"/>
-              <w:bottom w:type="dxa" w:w="60"/>
-              <w:right w:type="dxa" w:w="160"/>
-            </w:tcMar>
-          </w:tcPr>
-          <w:p>
-            <w:r>
-              <w:rPr>
-                <w:sz w:val="22"/>
-                <w:szCs w:val="22"/>
-              </w:rPr>
-              <w:t xml:space="preserve"/>
-            </w:r>
-          </w:p>
-        </w:tc>
-      </w:tr>
-      <w:tr>
-        <w:trPr>
-          <w:trHeight w:val="480"/>
-        </w:trPr>
-        <w:tc>
-          <w:tcPr>
-            <w:tcW w:type="dxa" w:w="9638"/>
-            <w:tcBorders>
-              <w:top w:val="single" w:color="E0E0E0" w:sz="4"/>
-              <w:left w:val="single" w:color="E0E0E0" w:sz="4"/>
-              <w:bottom w:val="single" w:color="E0E0E0" w:sz="4"/>
-              <w:right w:val="single" w:color="E0E0E0" w:sz="4"/>
-            </w:tcBorders>
-            <w:shd w:fill="FAFAFA" w:val="clear"/>
-            <w:tcMar>
-              <w:top w:type="dxa" w:w="60"/>
-              <w:left w:type="dxa" w:w="160"/>
-              <w:bottom w:type="dxa" w:w="60"/>
-              <w:right w:type="dxa" w:w="160"/>
-            </w:tcMar>
-          </w:tcPr>
-          <w:p>
-            <w:r>
-              <w:rPr>
-                <w:sz w:val="22"/>
-                <w:szCs w:val="22"/>
-              </w:rPr>
-              <w:t xml:space="preserve"/>
-            </w:r>
-          </w:p>
-        </w:tc>
-      </w:tr>
-      <w:tr>
-        <w:trPr>
-          <w:trHeight w:val="480"/>
-        </w:trPr>
-        <w:tc>
-          <w:tcPr>
-            <w:tcW w:type="dxa" w:w="9638"/>
-            <w:tcBorders>
-              <w:top w:val="single" w:color="E0E0E0" w:sz="4"/>
-              <w:left w:val="single" w:color="E0E0E0" w:sz="4"/>
-              <w:bottom w:val="single" w:color="E0E0E0" w:sz="4"/>
-              <w:right w:val="single" w:color="E0E0E0" w:sz="4"/>
-            </w:tcBorders>
-            <w:shd w:fill="FAFAFA" w:val="clear"/>
-            <w:tcMar>
-              <w:top w:type="dxa" w:w="60"/>
-              <w:left w:type="dxa" w:w="160"/>
-              <w:bottom w:type="dxa" w:w="60"/>
-              <w:right w:type="dxa" w:w="160"/>
-            </w:tcMar>
-          </w:tcPr>
-          <w:p>
-            <w:r>
-              <w:rPr>
-                <w:sz w:val="22"/>
-                <w:szCs w:val="22"/>
-              </w:rPr>
-              <w:t xml:space="preserve"/>
+              <w:top w:type="dxa" w:w="80"/>
+              <w:left w:type="dxa" w:w="160"/>
+              <w:bottom w:type="dxa" w:w="80"/>
+              <w:right w:type="dxa" w:w="160"/>
+            </w:tcMar>
+          </w:tcPr>
+          <w:p>
+            <w:pPr>
+              <w:jc w:val="center"/>
+            </w:pPr>
+            <w:r>
+              <w:rPr>
+                <w:rFonts w:ascii="Arial" w:cs="Arial" w:eastAsia="Arial" w:hAnsi="Arial"/>
+                <w:i/>
+                <w:iCs/>
+                <w:color w:val="757575"/>
+                <w:sz w:val="20"/>
+                <w:szCs w:val="20"/>
+              </w:rPr>
+              <w:t xml:space="preserve">[Pega aquí la captura de pantalla]</w:t>
             </w:r>
           </w:p>
         </w:tc>
@@ -642,34 +615,6 @@
     <w:p>
       <w:pPr>
         <w:spacing w:after="200"/>
-      </w:pPr>
-    </w:p>
-    <w:p>
-      <w:r>
-        <w:br w:type="page"/>
-      </w:r>
-    </w:p>
-    <w:p>
-      <w:pPr>
-        <w:shd w:fill="3949AB" w:val="clear"/>
-        <w:spacing w:after="0" w:before="320"/>
-        <w:ind w:left="200" w:right="200"/>
-      </w:pPr>
-      <w:r>
-        <w:rPr>
-          <w:rFonts w:ascii="Arial" w:cs="Arial" w:eastAsia="Arial" w:hAnsi="Arial"/>
-          <w:b/>
-          <w:bCs/>
-          <w:color w:val="FFFFFF"/>
-          <w:sz w:val="26"/>
-          <w:szCs w:val="26"/>
-        </w:rPr>
-        <w:t xml:space="preserve">Parte B — Reto: escala, actualiza y compara las tres formas</w:t>
-      </w:r>
-    </w:p>
-    <w:p>
-      <w:pPr>
-        <w:spacing w:after="120"/>
       </w:pPr>
     </w:p>
     <w:p>
@@ -688,7 +633,7 @@
           <w:sz w:val="24"/>
           <w:szCs w:val="24"/>
         </w:rPr>
-        <w:t xml:space="preserve">Escala el servicio</w:t>
+        <w:t xml:space="preserve">Paso 3 — Crea el clúster y la definición de tarea</w:t>
       </w:r>
     </w:p>
     <w:tbl>
@@ -734,7 +679,7 @@
                 <w:sz w:val="20"/>
                 <w:szCs w:val="20"/>
               </w:rPr>
-              <w:t xml:space="preserve">📸 El servicio escalado, con varias tareas en marcha repartiendo tráfico entre ellas</w:t>
+              <w:t xml:space="preserve">📸 Tu definición de tarea con la imagen, el tamaño de la tarea y el puerto</w:t>
             </w:r>
           </w:p>
         </w:tc>
@@ -781,8 +726,13 @@
     </w:tbl>
     <w:p>
       <w:pPr>
-        <w:spacing w:after="160"/>
-      </w:pPr>
+        <w:spacing w:after="200"/>
+      </w:pPr>
+    </w:p>
+    <w:p>
+      <w:r>
+        <w:br w:type="page"/>
+      </w:r>
     </w:p>
     <w:p>
       <w:pPr>
@@ -800,21 +750,7 @@
           <w:sz w:val="24"/>
           <w:szCs w:val="24"/>
         </w:rPr>
-        <w:t xml:space="preserve">Actualiza sin cortar el servicio</w:t>
-      </w:r>
-    </w:p>
-    <w:p>
-      <w:pPr>
-        <w:spacing w:after="100"/>
-      </w:pPr>
-      <w:r>
-        <w:rPr>
-          <w:rFonts w:ascii="Arial" w:cs="Arial" w:eastAsia="Arial" w:hAnsi="Arial"/>
-          <w:color w:val="212121"/>
-          <w:sz w:val="22"/>
-          <w:szCs w:val="22"/>
-        </w:rPr>
-        <w:t xml:space="preserve">Qué se observa durante la transición de versión 1 a versión 2: ¿hay algún momento en que el contador deja de responder?</w:t>
+        <w:t xml:space="preserve">Paso 4 — Ejecuta el servicio</w:t>
       </w:r>
     </w:p>
     <w:tbl>
@@ -833,8 +769,41 @@
         <w:gridCol w:w="9638"/>
       </w:tblGrid>
       <w:tr>
-        <w:trPr>
-          <w:trHeight w:val="480"/>
+        <w:tc>
+          <w:tcPr>
+            <w:tcW w:type="dxa" w:w="9638"/>
+            <w:tcBorders>
+              <w:top w:val="none" w:color="FFFFFF" w:sz="0"/>
+              <w:left w:val="none" w:color="FFFFFF" w:sz="0"/>
+              <w:bottom w:val="none" w:color="FFFFFF" w:sz="0"/>
+              <w:right w:val="none" w:color="FFFFFF" w:sz="0"/>
+            </w:tcBorders>
+            <w:shd w:fill="3949AB" w:val="clear"/>
+            <w:tcMar>
+              <w:top w:type="dxa" w:w="80"/>
+              <w:left w:type="dxa" w:w="160"/>
+              <w:bottom w:type="dxa" w:w="80"/>
+              <w:right w:type="dxa" w:w="160"/>
+            </w:tcMar>
+          </w:tcPr>
+          <w:p>
+            <w:r>
+              <w:rPr>
+                <w:rFonts w:ascii="Arial" w:cs="Arial" w:eastAsia="Arial" w:hAnsi="Arial"/>
+                <w:b/>
+                <w:bCs/>
+                <w:color w:val="FFFFFF"/>
+                <w:sz w:val="20"/>
+                <w:szCs w:val="20"/>
+              </w:rPr>
+              <w:t xml:space="preserve">📸 El servicio con su tarea en ejecución, y el contador abierto en el navegador</w:t>
+            </w:r>
+          </w:p>
+        </w:tc>
+      </w:tr>
+      <w:tr>
+        <w:trPr>
+          <w:trHeight w:val="2400"/>
         </w:trPr>
         <w:tc>
           <w:tcPr>
@@ -847,115 +816,26 @@
             </w:tcBorders>
             <w:shd w:fill="FAFAFA" w:val="clear"/>
             <w:tcMar>
-              <w:top w:type="dxa" w:w="60"/>
-              <w:left w:type="dxa" w:w="160"/>
-              <w:bottom w:type="dxa" w:w="60"/>
-              <w:right w:type="dxa" w:w="160"/>
-            </w:tcMar>
-          </w:tcPr>
-          <w:p>
-            <w:r>
-              <w:rPr>
-                <w:sz w:val="22"/>
-                <w:szCs w:val="22"/>
-              </w:rPr>
-              <w:t xml:space="preserve"/>
-            </w:r>
-          </w:p>
-        </w:tc>
-      </w:tr>
-      <w:tr>
-        <w:trPr>
-          <w:trHeight w:val="480"/>
-        </w:trPr>
-        <w:tc>
-          <w:tcPr>
-            <w:tcW w:type="dxa" w:w="9638"/>
-            <w:tcBorders>
-              <w:top w:val="single" w:color="E0E0E0" w:sz="4"/>
-              <w:left w:val="single" w:color="E0E0E0" w:sz="4"/>
-              <w:bottom w:val="single" w:color="E0E0E0" w:sz="4"/>
-              <w:right w:val="single" w:color="E0E0E0" w:sz="4"/>
-            </w:tcBorders>
-            <w:shd w:fill="FAFAFA" w:val="clear"/>
-            <w:tcMar>
-              <w:top w:type="dxa" w:w="60"/>
-              <w:left w:type="dxa" w:w="160"/>
-              <w:bottom w:type="dxa" w:w="60"/>
-              <w:right w:type="dxa" w:w="160"/>
-            </w:tcMar>
-          </w:tcPr>
-          <w:p>
-            <w:r>
-              <w:rPr>
-                <w:sz w:val="22"/>
-                <w:szCs w:val="22"/>
-              </w:rPr>
-              <w:t xml:space="preserve"/>
-            </w:r>
-          </w:p>
-        </w:tc>
-      </w:tr>
-      <w:tr>
-        <w:trPr>
-          <w:trHeight w:val="480"/>
-        </w:trPr>
-        <w:tc>
-          <w:tcPr>
-            <w:tcW w:type="dxa" w:w="9638"/>
-            <w:tcBorders>
-              <w:top w:val="single" w:color="E0E0E0" w:sz="4"/>
-              <w:left w:val="single" w:color="E0E0E0" w:sz="4"/>
-              <w:bottom w:val="single" w:color="E0E0E0" w:sz="4"/>
-              <w:right w:val="single" w:color="E0E0E0" w:sz="4"/>
-            </w:tcBorders>
-            <w:shd w:fill="FAFAFA" w:val="clear"/>
-            <w:tcMar>
-              <w:top w:type="dxa" w:w="60"/>
-              <w:left w:type="dxa" w:w="160"/>
-              <w:bottom w:type="dxa" w:w="60"/>
-              <w:right w:type="dxa" w:w="160"/>
-            </w:tcMar>
-          </w:tcPr>
-          <w:p>
-            <w:r>
-              <w:rPr>
-                <w:sz w:val="22"/>
-                <w:szCs w:val="22"/>
-              </w:rPr>
-              <w:t xml:space="preserve"/>
-            </w:r>
-          </w:p>
-        </w:tc>
-      </w:tr>
-      <w:tr>
-        <w:trPr>
-          <w:trHeight w:val="480"/>
-        </w:trPr>
-        <w:tc>
-          <w:tcPr>
-            <w:tcW w:type="dxa" w:w="9638"/>
-            <w:tcBorders>
-              <w:top w:val="single" w:color="E0E0E0" w:sz="4"/>
-              <w:left w:val="single" w:color="E0E0E0" w:sz="4"/>
-              <w:bottom w:val="single" w:color="E0E0E0" w:sz="4"/>
-              <w:right w:val="single" w:color="E0E0E0" w:sz="4"/>
-            </w:tcBorders>
-            <w:shd w:fill="FAFAFA" w:val="clear"/>
-            <w:tcMar>
-              <w:top w:type="dxa" w:w="60"/>
-              <w:left w:type="dxa" w:w="160"/>
-              <w:bottom w:type="dxa" w:w="60"/>
-              <w:right w:type="dxa" w:w="160"/>
-            </w:tcMar>
-          </w:tcPr>
-          <w:p>
-            <w:r>
-              <w:rPr>
-                <w:sz w:val="22"/>
-                <w:szCs w:val="22"/>
-              </w:rPr>
-              <w:t xml:space="preserve"/>
+              <w:top w:type="dxa" w:w="80"/>
+              <w:left w:type="dxa" w:w="160"/>
+              <w:bottom w:type="dxa" w:w="80"/>
+              <w:right w:type="dxa" w:w="160"/>
+            </w:tcMar>
+          </w:tcPr>
+          <w:p>
+            <w:pPr>
+              <w:jc w:val="center"/>
+            </w:pPr>
+            <w:r>
+              <w:rPr>
+                <w:rFonts w:ascii="Arial" w:cs="Arial" w:eastAsia="Arial" w:hAnsi="Arial"/>
+                <w:i/>
+                <w:iCs/>
+                <w:color w:val="757575"/>
+                <w:sz w:val="20"/>
+                <w:szCs w:val="20"/>
+              </w:rPr>
+              <w:t xml:space="preserve">[Pega aquí la captura de pantalla]</w:t>
             </w:r>
           </w:p>
         </w:tc>
@@ -963,8 +843,22 @@
     </w:tbl>
     <w:p>
       <w:pPr>
-        <w:spacing w:after="120"/>
-      </w:pPr>
+        <w:spacing w:after="160"/>
+      </w:pPr>
+    </w:p>
+    <w:p>
+      <w:pPr>
+        <w:spacing w:after="100"/>
+      </w:pPr>
+      <w:r>
+        <w:rPr>
+          <w:rFonts w:ascii="Arial" w:cs="Arial" w:eastAsia="Arial" w:hAnsi="Arial"/>
+          <w:color w:val="212121"/>
+          <w:sz w:val="22"/>
+          <w:szCs w:val="22"/>
+        </w:rPr>
+        <w:t xml:space="preserve">Tu predicción sobre lo que ocurrirá al detener la tarea, escrita antes de hacerlo:</w:t>
+      </w:r>
     </w:p>
     <w:tbl>
       <w:tblPr>
@@ -982,41 +876,8 @@
         <w:gridCol w:w="9638"/>
       </w:tblGrid>
       <w:tr>
-        <w:tc>
-          <w:tcPr>
-            <w:tcW w:type="dxa" w:w="9638"/>
-            <w:tcBorders>
-              <w:top w:val="none" w:color="FFFFFF" w:sz="0"/>
-              <w:left w:val="none" w:color="FFFFFF" w:sz="0"/>
-              <w:bottom w:val="none" w:color="FFFFFF" w:sz="0"/>
-              <w:right w:val="none" w:color="FFFFFF" w:sz="0"/>
-            </w:tcBorders>
-            <w:shd w:fill="3949AB" w:val="clear"/>
-            <w:tcMar>
-              <w:top w:type="dxa" w:w="80"/>
-              <w:left w:type="dxa" w:w="160"/>
-              <w:bottom w:type="dxa" w:w="80"/>
-              <w:right w:type="dxa" w:w="160"/>
-            </w:tcMar>
-          </w:tcPr>
-          <w:p>
-            <w:r>
-              <w:rPr>
-                <w:rFonts w:ascii="Arial" w:cs="Arial" w:eastAsia="Arial" w:hAnsi="Arial"/>
-                <w:b/>
-                <w:bCs/>
-                <w:color w:val="FFFFFF"/>
-                <w:sz w:val="20"/>
-                <w:szCs w:val="20"/>
-              </w:rPr>
-              <w:t xml:space="preserve">📸 Evidencia de la actualización sin corte (por ejemplo, peticiones continuas durante el despliegue)</w:t>
-            </w:r>
-          </w:p>
-        </w:tc>
-      </w:tr>
-      <w:tr>
-        <w:trPr>
-          <w:trHeight w:val="2400"/>
+        <w:trPr>
+          <w:trHeight w:val="480"/>
         </w:trPr>
         <w:tc>
           <w:tcPr>
@@ -1029,26 +890,83 @@
             </w:tcBorders>
             <w:shd w:fill="FAFAFA" w:val="clear"/>
             <w:tcMar>
-              <w:top w:type="dxa" w:w="80"/>
-              <w:left w:type="dxa" w:w="160"/>
-              <w:bottom w:type="dxa" w:w="80"/>
-              <w:right w:type="dxa" w:w="160"/>
-            </w:tcMar>
-          </w:tcPr>
-          <w:p>
-            <w:pPr>
-              <w:jc w:val="center"/>
-            </w:pPr>
-            <w:r>
-              <w:rPr>
-                <w:rFonts w:ascii="Arial" w:cs="Arial" w:eastAsia="Arial" w:hAnsi="Arial"/>
-                <w:i/>
-                <w:iCs/>
-                <w:color w:val="757575"/>
-                <w:sz w:val="20"/>
-                <w:szCs w:val="20"/>
-              </w:rPr>
-              <w:t xml:space="preserve">[Pega aquí la captura de pantalla]</w:t>
+              <w:top w:type="dxa" w:w="60"/>
+              <w:left w:type="dxa" w:w="160"/>
+              <w:bottom w:type="dxa" w:w="60"/>
+              <w:right w:type="dxa" w:w="160"/>
+            </w:tcMar>
+          </w:tcPr>
+          <w:p>
+            <w:r>
+              <w:rPr>
+                <w:sz w:val="22"/>
+                <w:szCs w:val="22"/>
+              </w:rPr>
+              <w:t xml:space="preserve"/>
+            </w:r>
+          </w:p>
+        </w:tc>
+      </w:tr>
+      <w:tr>
+        <w:trPr>
+          <w:trHeight w:val="480"/>
+        </w:trPr>
+        <w:tc>
+          <w:tcPr>
+            <w:tcW w:type="dxa" w:w="9638"/>
+            <w:tcBorders>
+              <w:top w:val="single" w:color="E0E0E0" w:sz="4"/>
+              <w:left w:val="single" w:color="E0E0E0" w:sz="4"/>
+              <w:bottom w:val="single" w:color="E0E0E0" w:sz="4"/>
+              <w:right w:val="single" w:color="E0E0E0" w:sz="4"/>
+            </w:tcBorders>
+            <w:shd w:fill="FAFAFA" w:val="clear"/>
+            <w:tcMar>
+              <w:top w:type="dxa" w:w="60"/>
+              <w:left w:type="dxa" w:w="160"/>
+              <w:bottom w:type="dxa" w:w="60"/>
+              <w:right w:type="dxa" w:w="160"/>
+            </w:tcMar>
+          </w:tcPr>
+          <w:p>
+            <w:r>
+              <w:rPr>
+                <w:sz w:val="22"/>
+                <w:szCs w:val="22"/>
+              </w:rPr>
+              <w:t xml:space="preserve"/>
+            </w:r>
+          </w:p>
+        </w:tc>
+      </w:tr>
+      <w:tr>
+        <w:trPr>
+          <w:trHeight w:val="480"/>
+        </w:trPr>
+        <w:tc>
+          <w:tcPr>
+            <w:tcW w:type="dxa" w:w="9638"/>
+            <w:tcBorders>
+              <w:top w:val="single" w:color="E0E0E0" w:sz="4"/>
+              <w:left w:val="single" w:color="E0E0E0" w:sz="4"/>
+              <w:bottom w:val="single" w:color="E0E0E0" w:sz="4"/>
+              <w:right w:val="single" w:color="E0E0E0" w:sz="4"/>
+            </w:tcBorders>
+            <w:shd w:fill="FAFAFA" w:val="clear"/>
+            <w:tcMar>
+              <w:top w:type="dxa" w:w="60"/>
+              <w:left w:type="dxa" w:w="160"/>
+              <w:bottom w:type="dxa" w:w="60"/>
+              <w:right w:type="dxa" w:w="160"/>
+            </w:tcMar>
+          </w:tcPr>
+          <w:p>
+            <w:r>
+              <w:rPr>
+                <w:sz w:val="22"/>
+                <w:szCs w:val="22"/>
+              </w:rPr>
+              <w:t xml:space="preserve"/>
             </w:r>
           </w:p>
         </w:tc>
@@ -1056,13 +974,8 @@
     </w:tbl>
     <w:p>
       <w:pPr>
-        <w:spacing w:after="200"/>
-      </w:pPr>
-    </w:p>
-    <w:p>
-      <w:r>
-        <w:br w:type="page"/>
-      </w:r>
+        <w:spacing w:after="160"/>
+      </w:pPr>
     </w:p>
     <w:p>
       <w:pPr>
@@ -1080,7 +993,7 @@
           <w:sz w:val="24"/>
           <w:szCs w:val="24"/>
         </w:rPr>
-        <w:t xml:space="preserve">Construye la tabla comparativa final</w:t>
+        <w:t xml:space="preserve">Reflexiona (Paso 4)</w:t>
       </w:r>
     </w:p>
     <w:p>
@@ -1094,7 +1007,7 @@
           <w:sz w:val="22"/>
           <w:szCs w:val="22"/>
         </w:rPr>
-        <w:t xml:space="preserve">Datos propios de las tres formas de este tema (la instancia de prueba de la Actividad 6.1, la función de la Actividad 6.2, el contenedor de hoy), con justificación de cada celda a partir de lo medido, no de la teoría.</w:t>
+        <w:t xml:space="preserve">¿Ha coincidido tu predicción? Número de tareas, tiempo hasta que vuelve a haber una en ejecución, IP pública nueva, qué problema tendría una aplicación real y qué pieza de la teoría lo resuelve.</w:t>
       </w:r>
     </w:p>
     <w:tbl>
@@ -1110,33 +1023,255 @@
         </w:tblBorders>
       </w:tblPr>
       <w:tblGrid>
-        <w:gridCol w:w="1928"/>
-        <w:gridCol w:w="1928"/>
-        <w:gridCol w:w="2410"/>
-        <w:gridCol w:w="3372"/>
+        <w:gridCol w:w="9638"/>
       </w:tblGrid>
       <w:tr>
-        <w:tc>
-          <w:tcPr>
-            <w:tcW w:type="dxa" w:w="1928"/>
-            <w:tcBorders>
-              <w:top w:val="single" w:color="E0E0E0" w:sz="4"/>
-              <w:left w:val="single" w:color="E0E0E0" w:sz="4"/>
-              <w:bottom w:val="single" w:color="E0E0E0" w:sz="4"/>
-              <w:right w:val="single" w:color="E0E0E0" w:sz="4"/>
+        <w:trPr>
+          <w:trHeight w:val="480"/>
+        </w:trPr>
+        <w:tc>
+          <w:tcPr>
+            <w:tcW w:type="dxa" w:w="9638"/>
+            <w:tcBorders>
+              <w:top w:val="single" w:color="E0E0E0" w:sz="4"/>
+              <w:left w:val="single" w:color="E0E0E0" w:sz="4"/>
+              <w:bottom w:val="single" w:color="E0E0E0" w:sz="4"/>
+              <w:right w:val="single" w:color="E0E0E0" w:sz="4"/>
+            </w:tcBorders>
+            <w:shd w:fill="FAFAFA" w:val="clear"/>
+            <w:tcMar>
+              <w:top w:type="dxa" w:w="60"/>
+              <w:left w:type="dxa" w:w="160"/>
+              <w:bottom w:type="dxa" w:w="60"/>
+              <w:right w:type="dxa" w:w="160"/>
+            </w:tcMar>
+          </w:tcPr>
+          <w:p>
+            <w:r>
+              <w:rPr>
+                <w:sz w:val="22"/>
+                <w:szCs w:val="22"/>
+              </w:rPr>
+              <w:t xml:space="preserve"/>
+            </w:r>
+          </w:p>
+        </w:tc>
+      </w:tr>
+      <w:tr>
+        <w:trPr>
+          <w:trHeight w:val="480"/>
+        </w:trPr>
+        <w:tc>
+          <w:tcPr>
+            <w:tcW w:type="dxa" w:w="9638"/>
+            <w:tcBorders>
+              <w:top w:val="single" w:color="E0E0E0" w:sz="4"/>
+              <w:left w:val="single" w:color="E0E0E0" w:sz="4"/>
+              <w:bottom w:val="single" w:color="E0E0E0" w:sz="4"/>
+              <w:right w:val="single" w:color="E0E0E0" w:sz="4"/>
+            </w:tcBorders>
+            <w:shd w:fill="FAFAFA" w:val="clear"/>
+            <w:tcMar>
+              <w:top w:type="dxa" w:w="60"/>
+              <w:left w:type="dxa" w:w="160"/>
+              <w:bottom w:type="dxa" w:w="60"/>
+              <w:right w:type="dxa" w:w="160"/>
+            </w:tcMar>
+          </w:tcPr>
+          <w:p>
+            <w:r>
+              <w:rPr>
+                <w:sz w:val="22"/>
+                <w:szCs w:val="22"/>
+              </w:rPr>
+              <w:t xml:space="preserve"/>
+            </w:r>
+          </w:p>
+        </w:tc>
+      </w:tr>
+      <w:tr>
+        <w:trPr>
+          <w:trHeight w:val="480"/>
+        </w:trPr>
+        <w:tc>
+          <w:tcPr>
+            <w:tcW w:type="dxa" w:w="9638"/>
+            <w:tcBorders>
+              <w:top w:val="single" w:color="E0E0E0" w:sz="4"/>
+              <w:left w:val="single" w:color="E0E0E0" w:sz="4"/>
+              <w:bottom w:val="single" w:color="E0E0E0" w:sz="4"/>
+              <w:right w:val="single" w:color="E0E0E0" w:sz="4"/>
+            </w:tcBorders>
+            <w:shd w:fill="FAFAFA" w:val="clear"/>
+            <w:tcMar>
+              <w:top w:type="dxa" w:w="60"/>
+              <w:left w:type="dxa" w:w="160"/>
+              <w:bottom w:type="dxa" w:w="60"/>
+              <w:right w:type="dxa" w:w="160"/>
+            </w:tcMar>
+          </w:tcPr>
+          <w:p>
+            <w:r>
+              <w:rPr>
+                <w:sz w:val="22"/>
+                <w:szCs w:val="22"/>
+              </w:rPr>
+              <w:t xml:space="preserve"/>
+            </w:r>
+          </w:p>
+        </w:tc>
+      </w:tr>
+      <w:tr>
+        <w:trPr>
+          <w:trHeight w:val="480"/>
+        </w:trPr>
+        <w:tc>
+          <w:tcPr>
+            <w:tcW w:type="dxa" w:w="9638"/>
+            <w:tcBorders>
+              <w:top w:val="single" w:color="E0E0E0" w:sz="4"/>
+              <w:left w:val="single" w:color="E0E0E0" w:sz="4"/>
+              <w:bottom w:val="single" w:color="E0E0E0" w:sz="4"/>
+              <w:right w:val="single" w:color="E0E0E0" w:sz="4"/>
+            </w:tcBorders>
+            <w:shd w:fill="FAFAFA" w:val="clear"/>
+            <w:tcMar>
+              <w:top w:type="dxa" w:w="60"/>
+              <w:left w:type="dxa" w:w="160"/>
+              <w:bottom w:type="dxa" w:w="60"/>
+              <w:right w:type="dxa" w:w="160"/>
+            </w:tcMar>
+          </w:tcPr>
+          <w:p>
+            <w:r>
+              <w:rPr>
+                <w:sz w:val="22"/>
+                <w:szCs w:val="22"/>
+              </w:rPr>
+              <w:t xml:space="preserve"/>
+            </w:r>
+          </w:p>
+        </w:tc>
+      </w:tr>
+      <w:tr>
+        <w:trPr>
+          <w:trHeight w:val="480"/>
+        </w:trPr>
+        <w:tc>
+          <w:tcPr>
+            <w:tcW w:type="dxa" w:w="9638"/>
+            <w:tcBorders>
+              <w:top w:val="single" w:color="E0E0E0" w:sz="4"/>
+              <w:left w:val="single" w:color="E0E0E0" w:sz="4"/>
+              <w:bottom w:val="single" w:color="E0E0E0" w:sz="4"/>
+              <w:right w:val="single" w:color="E0E0E0" w:sz="4"/>
+            </w:tcBorders>
+            <w:shd w:fill="FAFAFA" w:val="clear"/>
+            <w:tcMar>
+              <w:top w:type="dxa" w:w="60"/>
+              <w:left w:type="dxa" w:w="160"/>
+              <w:bottom w:type="dxa" w:w="60"/>
+              <w:right w:type="dxa" w:w="160"/>
+            </w:tcMar>
+          </w:tcPr>
+          <w:p>
+            <w:r>
+              <w:rPr>
+                <w:sz w:val="22"/>
+                <w:szCs w:val="22"/>
+              </w:rPr>
+              <w:t xml:space="preserve"/>
+            </w:r>
+          </w:p>
+        </w:tc>
+      </w:tr>
+    </w:tbl>
+    <w:p>
+      <w:pPr>
+        <w:spacing w:after="200"/>
+      </w:pPr>
+    </w:p>
+    <w:p>
+      <w:r>
+        <w:br w:type="page"/>
+      </w:r>
+    </w:p>
+    <w:p>
+      <w:pPr>
+        <w:shd w:fill="3949AB" w:val="clear"/>
+        <w:spacing w:after="0" w:before="320"/>
+        <w:ind w:left="200" w:right="200"/>
+      </w:pPr>
+      <w:r>
+        <w:rPr>
+          <w:rFonts w:ascii="Arial" w:cs="Arial" w:eastAsia="Arial" w:hAnsi="Arial"/>
+          <w:b/>
+          <w:bCs/>
+          <w:color w:val="FFFFFF"/>
+          <w:sz w:val="26"/>
+          <w:szCs w:val="26"/>
+        </w:rPr>
+        <w:t xml:space="preserve">Parte B — Reto: escala, actualiza y compara</w:t>
+      </w:r>
+    </w:p>
+    <w:p>
+      <w:pPr>
+        <w:spacing w:after="120"/>
+      </w:pPr>
+    </w:p>
+    <w:p>
+      <w:pPr>
+        <w:pBdr>
+          <w:bottom w:val="single" w:color="FFA000" w:sz="4" w:space="1"/>
+        </w:pBdr>
+        <w:spacing w:after="120" w:before="240"/>
+      </w:pPr>
+      <w:r>
+        <w:rPr>
+          <w:rFonts w:ascii="Arial" w:cs="Arial" w:eastAsia="Arial" w:hAnsi="Arial"/>
+          <w:b/>
+          <w:bCs/>
+          <w:color w:val="3949AB"/>
+          <w:sz w:val="24"/>
+          <w:szCs w:val="24"/>
+        </w:rPr>
+        <w:t xml:space="preserve">Escala detrás de un balanceador</w:t>
+      </w:r>
+    </w:p>
+    <w:tbl>
+      <w:tblPr>
+        <w:tblW w:type="dxa" w:w="9638"/>
+        <w:tblBorders>
+          <w:top w:val="single" w:color="auto" w:sz="4"/>
+          <w:left w:val="single" w:color="auto" w:sz="4"/>
+          <w:bottom w:val="single" w:color="auto" w:sz="4"/>
+          <w:right w:val="single" w:color="auto" w:sz="4"/>
+          <w:insideH w:val="single" w:color="auto" w:sz="4"/>
+          <w:insideV w:val="single" w:color="auto" w:sz="4"/>
+        </w:tblBorders>
+      </w:tblPr>
+      <w:tblGrid>
+        <w:gridCol w:w="9638"/>
+      </w:tblGrid>
+      <w:tr>
+        <w:tc>
+          <w:tcPr>
+            <w:tcW w:type="dxa" w:w="9638"/>
+            <w:tcBorders>
+              <w:top w:val="none" w:color="FFFFFF" w:sz="0"/>
+              <w:left w:val="none" w:color="FFFFFF" w:sz="0"/>
+              <w:bottom w:val="none" w:color="FFFFFF" w:sz="0"/>
+              <w:right w:val="none" w:color="FFFFFF" w:sz="0"/>
             </w:tcBorders>
             <w:shd w:fill="3949AB" w:val="clear"/>
             <w:tcMar>
-              <w:top w:type="dxa" w:w="100"/>
-              <w:left w:type="dxa" w:w="140"/>
-              <w:bottom w:type="dxa" w:w="100"/>
-              <w:right w:type="dxa" w:w="100"/>
-            </w:tcMar>
-          </w:tcPr>
-          <w:p>
-            <w:pPr>
-              <w:jc w:val="center"/>
-            </w:pPr>
+              <w:top w:type="dxa" w:w="80"/>
+              <w:left w:type="dxa" w:w="160"/>
+              <w:bottom w:type="dxa" w:w="80"/>
+              <w:right w:type="dxa" w:w="160"/>
+            </w:tcMar>
+          </w:tcPr>
+          <w:p>
             <w:r>
               <w:rPr>
                 <w:rFonts w:ascii="Arial" w:cs="Arial" w:eastAsia="Arial" w:hAnsi="Arial"/>
@@ -1146,31 +1281,304 @@
                 <w:sz w:val="20"/>
                 <w:szCs w:val="20"/>
               </w:rPr>
-              <w:t xml:space="preserve">Tiempo de despliegue</w:t>
-            </w:r>
-          </w:p>
-        </w:tc>
-        <w:tc>
-          <w:tcPr>
-            <w:tcW w:type="dxa" w:w="1928"/>
-            <w:tcBorders>
-              <w:top w:val="single" w:color="E0E0E0" w:sz="4"/>
-              <w:left w:val="single" w:color="E0E0E0" w:sz="4"/>
-              <w:bottom w:val="single" w:color="E0E0E0" w:sz="4"/>
-              <w:right w:val="single" w:color="E0E0E0" w:sz="4"/>
-            </w:tcBorders>
-            <w:shd w:fill="3949AB" w:val="clear"/>
-            <w:tcMar>
-              <w:top w:type="dxa" w:w="100"/>
-              <w:left w:type="dxa" w:w="140"/>
-              <w:bottom w:type="dxa" w:w="100"/>
-              <w:right w:type="dxa" w:w="100"/>
+              <w:t xml:space="preserve">📸 Las respuestas del servicio mostrando al menos tres tareas distintas repartiéndose las peticiones</w:t>
+            </w:r>
+          </w:p>
+        </w:tc>
+      </w:tr>
+      <w:tr>
+        <w:trPr>
+          <w:trHeight w:val="2400"/>
+        </w:trPr>
+        <w:tc>
+          <w:tcPr>
+            <w:tcW w:type="dxa" w:w="9638"/>
+            <w:tcBorders>
+              <w:top w:val="single" w:color="E0E0E0" w:sz="4"/>
+              <w:left w:val="single" w:color="E0E0E0" w:sz="4"/>
+              <w:bottom w:val="single" w:color="E0E0E0" w:sz="4"/>
+              <w:right w:val="single" w:color="E0E0E0" w:sz="4"/>
+            </w:tcBorders>
+            <w:shd w:fill="FAFAFA" w:val="clear"/>
+            <w:tcMar>
+              <w:top w:type="dxa" w:w="80"/>
+              <w:left w:type="dxa" w:w="160"/>
+              <w:bottom w:type="dxa" w:w="80"/>
+              <w:right w:type="dxa" w:w="160"/>
             </w:tcMar>
           </w:tcPr>
           <w:p>
             <w:pPr>
               <w:jc w:val="center"/>
             </w:pPr>
+            <w:r>
+              <w:rPr>
+                <w:rFonts w:ascii="Arial" w:cs="Arial" w:eastAsia="Arial" w:hAnsi="Arial"/>
+                <w:i/>
+                <w:iCs/>
+                <w:color w:val="757575"/>
+                <w:sz w:val="20"/>
+                <w:szCs w:val="20"/>
+              </w:rPr>
+              <w:t xml:space="preserve">[Pega aquí la captura de pantalla]</w:t>
+            </w:r>
+          </w:p>
+        </w:tc>
+      </w:tr>
+    </w:tbl>
+    <w:p>
+      <w:pPr>
+        <w:spacing w:after="160"/>
+      </w:pPr>
+    </w:p>
+    <w:p>
+      <w:pPr>
+        <w:pBdr>
+          <w:bottom w:val="single" w:color="FFA000" w:sz="4" w:space="1"/>
+        </w:pBdr>
+        <w:spacing w:after="120" w:before="240"/>
+      </w:pPr>
+      <w:r>
+        <w:rPr>
+          <w:rFonts w:ascii="Arial" w:cs="Arial" w:eastAsia="Arial" w:hAnsi="Arial"/>
+          <w:b/>
+          <w:bCs/>
+          <w:color w:val="3949AB"/>
+          <w:sz w:val="24"/>
+          <w:szCs w:val="24"/>
+        </w:rPr>
+        <w:t xml:space="preserve">Actualiza a la versión 2 sin cortar el servicio</w:t>
+      </w:r>
+    </w:p>
+    <w:p>
+      <w:pPr>
+        <w:spacing w:after="100"/>
+      </w:pPr>
+      <w:r>
+        <w:rPr>
+          <w:rFonts w:ascii="Arial" w:cs="Arial" w:eastAsia="Arial" w:hAnsi="Arial"/>
+          <w:color w:val="212121"/>
+          <w:sz w:val="22"/>
+          <w:szCs w:val="22"/>
+        </w:rPr>
+        <w:t xml:space="preserve">Cómo lo has medido y qué has visto: respuestas por versión durante el cambio, cuándo aparece la versión 2, máximo de tareas en marcha a la vez, y si ha habido alguna respuesta con error.</w:t>
+      </w:r>
+    </w:p>
+    <w:tbl>
+      <w:tblPr>
+        <w:tblW w:type="dxa" w:w="9638"/>
+        <w:tblBorders>
+          <w:top w:val="single" w:color="auto" w:sz="4"/>
+          <w:left w:val="single" w:color="auto" w:sz="4"/>
+          <w:bottom w:val="single" w:color="auto" w:sz="4"/>
+          <w:right w:val="single" w:color="auto" w:sz="4"/>
+          <w:insideH w:val="single" w:color="auto" w:sz="4"/>
+          <w:insideV w:val="single" w:color="auto" w:sz="4"/>
+        </w:tblBorders>
+      </w:tblPr>
+      <w:tblGrid>
+        <w:gridCol w:w="9638"/>
+      </w:tblGrid>
+      <w:tr>
+        <w:trPr>
+          <w:trHeight w:val="480"/>
+        </w:trPr>
+        <w:tc>
+          <w:tcPr>
+            <w:tcW w:type="dxa" w:w="9638"/>
+            <w:tcBorders>
+              <w:top w:val="single" w:color="E0E0E0" w:sz="4"/>
+              <w:left w:val="single" w:color="E0E0E0" w:sz="4"/>
+              <w:bottom w:val="single" w:color="E0E0E0" w:sz="4"/>
+              <w:right w:val="single" w:color="E0E0E0" w:sz="4"/>
+            </w:tcBorders>
+            <w:shd w:fill="FAFAFA" w:val="clear"/>
+            <w:tcMar>
+              <w:top w:type="dxa" w:w="60"/>
+              <w:left w:type="dxa" w:w="160"/>
+              <w:bottom w:type="dxa" w:w="60"/>
+              <w:right w:type="dxa" w:w="160"/>
+            </w:tcMar>
+          </w:tcPr>
+          <w:p>
+            <w:r>
+              <w:rPr>
+                <w:sz w:val="22"/>
+                <w:szCs w:val="22"/>
+              </w:rPr>
+              <w:t xml:space="preserve"/>
+            </w:r>
+          </w:p>
+        </w:tc>
+      </w:tr>
+      <w:tr>
+        <w:trPr>
+          <w:trHeight w:val="480"/>
+        </w:trPr>
+        <w:tc>
+          <w:tcPr>
+            <w:tcW w:type="dxa" w:w="9638"/>
+            <w:tcBorders>
+              <w:top w:val="single" w:color="E0E0E0" w:sz="4"/>
+              <w:left w:val="single" w:color="E0E0E0" w:sz="4"/>
+              <w:bottom w:val="single" w:color="E0E0E0" w:sz="4"/>
+              <w:right w:val="single" w:color="E0E0E0" w:sz="4"/>
+            </w:tcBorders>
+            <w:shd w:fill="FAFAFA" w:val="clear"/>
+            <w:tcMar>
+              <w:top w:type="dxa" w:w="60"/>
+              <w:left w:type="dxa" w:w="160"/>
+              <w:bottom w:type="dxa" w:w="60"/>
+              <w:right w:type="dxa" w:w="160"/>
+            </w:tcMar>
+          </w:tcPr>
+          <w:p>
+            <w:r>
+              <w:rPr>
+                <w:sz w:val="22"/>
+                <w:szCs w:val="22"/>
+              </w:rPr>
+              <w:t xml:space="preserve"/>
+            </w:r>
+          </w:p>
+        </w:tc>
+      </w:tr>
+      <w:tr>
+        <w:trPr>
+          <w:trHeight w:val="480"/>
+        </w:trPr>
+        <w:tc>
+          <w:tcPr>
+            <w:tcW w:type="dxa" w:w="9638"/>
+            <w:tcBorders>
+              <w:top w:val="single" w:color="E0E0E0" w:sz="4"/>
+              <w:left w:val="single" w:color="E0E0E0" w:sz="4"/>
+              <w:bottom w:val="single" w:color="E0E0E0" w:sz="4"/>
+              <w:right w:val="single" w:color="E0E0E0" w:sz="4"/>
+            </w:tcBorders>
+            <w:shd w:fill="FAFAFA" w:val="clear"/>
+            <w:tcMar>
+              <w:top w:type="dxa" w:w="60"/>
+              <w:left w:type="dxa" w:w="160"/>
+              <w:bottom w:type="dxa" w:w="60"/>
+              <w:right w:type="dxa" w:w="160"/>
+            </w:tcMar>
+          </w:tcPr>
+          <w:p>
+            <w:r>
+              <w:rPr>
+                <w:sz w:val="22"/>
+                <w:szCs w:val="22"/>
+              </w:rPr>
+              <w:t xml:space="preserve"/>
+            </w:r>
+          </w:p>
+        </w:tc>
+      </w:tr>
+      <w:tr>
+        <w:trPr>
+          <w:trHeight w:val="480"/>
+        </w:trPr>
+        <w:tc>
+          <w:tcPr>
+            <w:tcW w:type="dxa" w:w="9638"/>
+            <w:tcBorders>
+              <w:top w:val="single" w:color="E0E0E0" w:sz="4"/>
+              <w:left w:val="single" w:color="E0E0E0" w:sz="4"/>
+              <w:bottom w:val="single" w:color="E0E0E0" w:sz="4"/>
+              <w:right w:val="single" w:color="E0E0E0" w:sz="4"/>
+            </w:tcBorders>
+            <w:shd w:fill="FAFAFA" w:val="clear"/>
+            <w:tcMar>
+              <w:top w:type="dxa" w:w="60"/>
+              <w:left w:type="dxa" w:w="160"/>
+              <w:bottom w:type="dxa" w:w="60"/>
+              <w:right w:type="dxa" w:w="160"/>
+            </w:tcMar>
+          </w:tcPr>
+          <w:p>
+            <w:r>
+              <w:rPr>
+                <w:sz w:val="22"/>
+                <w:szCs w:val="22"/>
+              </w:rPr>
+              <w:t xml:space="preserve"/>
+            </w:r>
+          </w:p>
+        </w:tc>
+      </w:tr>
+      <w:tr>
+        <w:trPr>
+          <w:trHeight w:val="480"/>
+        </w:trPr>
+        <w:tc>
+          <w:tcPr>
+            <w:tcW w:type="dxa" w:w="9638"/>
+            <w:tcBorders>
+              <w:top w:val="single" w:color="E0E0E0" w:sz="4"/>
+              <w:left w:val="single" w:color="E0E0E0" w:sz="4"/>
+              <w:bottom w:val="single" w:color="E0E0E0" w:sz="4"/>
+              <w:right w:val="single" w:color="E0E0E0" w:sz="4"/>
+            </w:tcBorders>
+            <w:shd w:fill="FAFAFA" w:val="clear"/>
+            <w:tcMar>
+              <w:top w:type="dxa" w:w="60"/>
+              <w:left w:type="dxa" w:w="160"/>
+              <w:bottom w:type="dxa" w:w="60"/>
+              <w:right w:type="dxa" w:w="160"/>
+            </w:tcMar>
+          </w:tcPr>
+          <w:p>
+            <w:r>
+              <w:rPr>
+                <w:sz w:val="22"/>
+                <w:szCs w:val="22"/>
+              </w:rPr>
+              <w:t xml:space="preserve"/>
+            </w:r>
+          </w:p>
+        </w:tc>
+      </w:tr>
+    </w:tbl>
+    <w:p>
+      <w:pPr>
+        <w:spacing w:after="120"/>
+      </w:pPr>
+    </w:p>
+    <w:tbl>
+      <w:tblPr>
+        <w:tblW w:type="dxa" w:w="9638"/>
+        <w:tblBorders>
+          <w:top w:val="single" w:color="auto" w:sz="4"/>
+          <w:left w:val="single" w:color="auto" w:sz="4"/>
+          <w:bottom w:val="single" w:color="auto" w:sz="4"/>
+          <w:right w:val="single" w:color="auto" w:sz="4"/>
+          <w:insideH w:val="single" w:color="auto" w:sz="4"/>
+          <w:insideV w:val="single" w:color="auto" w:sz="4"/>
+        </w:tblBorders>
+      </w:tblPr>
+      <w:tblGrid>
+        <w:gridCol w:w="9638"/>
+      </w:tblGrid>
+      <w:tr>
+        <w:tc>
+          <w:tcPr>
+            <w:tcW w:type="dxa" w:w="9638"/>
+            <w:tcBorders>
+              <w:top w:val="none" w:color="FFFFFF" w:sz="0"/>
+              <w:left w:val="none" w:color="FFFFFF" w:sz="0"/>
+              <w:bottom w:val="none" w:color="FFFFFF" w:sz="0"/>
+              <w:right w:val="none" w:color="FFFFFF" w:sz="0"/>
+            </w:tcBorders>
+            <w:shd w:fill="3949AB" w:val="clear"/>
+            <w:tcMar>
+              <w:top w:type="dxa" w:w="80"/>
+              <w:left w:type="dxa" w:w="160"/>
+              <w:bottom w:type="dxa" w:w="80"/>
+              <w:right w:type="dxa" w:w="160"/>
+            </w:tcMar>
+          </w:tcPr>
+          <w:p>
             <w:r>
               <w:rPr>
                 <w:rFonts w:ascii="Arial" w:cs="Arial" w:eastAsia="Arial" w:hAnsi="Arial"/>
@@ -1180,13 +1588,116 @@
                 <w:sz w:val="20"/>
                 <w:szCs w:val="20"/>
               </w:rPr>
-              <w:t xml:space="preserve">Coste estimado</w:t>
-            </w:r>
-          </w:p>
-        </w:tc>
-        <w:tc>
-          <w:tcPr>
-            <w:tcW w:type="dxa" w:w="2410"/>
+              <w:t xml:space="preserve">📸 Los datos de la actualización (respuestas por versión y máximo de tareas simultáneas)</w:t>
+            </w:r>
+          </w:p>
+        </w:tc>
+      </w:tr>
+      <w:tr>
+        <w:trPr>
+          <w:trHeight w:val="2400"/>
+        </w:trPr>
+        <w:tc>
+          <w:tcPr>
+            <w:tcW w:type="dxa" w:w="9638"/>
+            <w:tcBorders>
+              <w:top w:val="single" w:color="E0E0E0" w:sz="4"/>
+              <w:left w:val="single" w:color="E0E0E0" w:sz="4"/>
+              <w:bottom w:val="single" w:color="E0E0E0" w:sz="4"/>
+              <w:right w:val="single" w:color="E0E0E0" w:sz="4"/>
+            </w:tcBorders>
+            <w:shd w:fill="FAFAFA" w:val="clear"/>
+            <w:tcMar>
+              <w:top w:type="dxa" w:w="80"/>
+              <w:left w:type="dxa" w:w="160"/>
+              <w:bottom w:type="dxa" w:w="80"/>
+              <w:right w:type="dxa" w:w="160"/>
+            </w:tcMar>
+          </w:tcPr>
+          <w:p>
+            <w:pPr>
+              <w:jc w:val="center"/>
+            </w:pPr>
+            <w:r>
+              <w:rPr>
+                <w:rFonts w:ascii="Arial" w:cs="Arial" w:eastAsia="Arial" w:hAnsi="Arial"/>
+                <w:i/>
+                <w:iCs/>
+                <w:color w:val="757575"/>
+                <w:sz w:val="20"/>
+                <w:szCs w:val="20"/>
+              </w:rPr>
+              <w:t xml:space="preserve">[Pega aquí la captura de pantalla]</w:t>
+            </w:r>
+          </w:p>
+        </w:tc>
+      </w:tr>
+    </w:tbl>
+    <w:p>
+      <w:pPr>
+        <w:spacing w:after="200"/>
+      </w:pPr>
+    </w:p>
+    <w:p>
+      <w:r>
+        <w:br w:type="page"/>
+      </w:r>
+    </w:p>
+    <w:p>
+      <w:pPr>
+        <w:pBdr>
+          <w:bottom w:val="single" w:color="FFA000" w:sz="4" w:space="1"/>
+        </w:pBdr>
+        <w:spacing w:after="120" w:before="240"/>
+      </w:pPr>
+      <w:r>
+        <w:rPr>
+          <w:rFonts w:ascii="Arial" w:cs="Arial" w:eastAsia="Arial" w:hAnsi="Arial"/>
+          <w:b/>
+          <w:bCs/>
+          <w:color w:val="3949AB"/>
+          <w:sz w:val="24"/>
+          <w:szCs w:val="24"/>
+        </w:rPr>
+        <w:t xml:space="preserve">Compara las tres formas de ejecutar una aplicación</w:t>
+      </w:r>
+    </w:p>
+    <w:p>
+      <w:pPr>
+        <w:spacing w:after="100"/>
+      </w:pPr>
+      <w:r>
+        <w:rPr>
+          <w:rFonts w:ascii="Arial" w:cs="Arial" w:eastAsia="Arial" w:hAnsi="Arial"/>
+          <w:color w:val="212121"/>
+          <w:sz w:val="22"/>
+          <w:szCs w:val="22"/>
+        </w:rPr>
+        <w:t xml:space="preserve">Datos propios de las tres formas de este tema (la instancia de la Actividad 6.1, la función de la 6.2, el contenedor de hoy), con la fuente de cada dato: una medida tuya o un precio de la calculadora.</w:t>
+      </w:r>
+    </w:p>
+    <w:tbl>
+      <w:tblPr>
+        <w:tblW w:type="dxa" w:w="9638"/>
+        <w:tblBorders>
+          <w:top w:val="single" w:color="auto" w:sz="4"/>
+          <w:left w:val="single" w:color="auto" w:sz="4"/>
+          <w:bottom w:val="single" w:color="auto" w:sz="4"/>
+          <w:right w:val="single" w:color="auto" w:sz="4"/>
+          <w:insideH w:val="single" w:color="auto" w:sz="4"/>
+          <w:insideV w:val="single" w:color="auto" w:sz="4"/>
+        </w:tblBorders>
+      </w:tblPr>
+      <w:tblGrid>
+        <w:gridCol w:w="2120"/>
+        <w:gridCol w:w="2506"/>
+        <w:gridCol w:w="2506"/>
+        <w:gridCol w:w="2506"/>
+      </w:tblGrid>
+      <w:tr>
+        <w:tc>
+          <w:tcPr>
+            <w:tcW w:type="dxa" w:w="2120"/>
             <w:tcBorders>
               <w:top w:val="single" w:color="E0E0E0" w:sz="4"/>
               <w:left w:val="single" w:color="E0E0E0" w:sz="4"/>
@@ -1214,13 +1725,13 @@
                 <w:sz w:val="20"/>
                 <w:szCs w:val="20"/>
               </w:rPr>
-              <w:t xml:space="preserve">Esfuerzo operativo</w:t>
-            </w:r>
-          </w:p>
-        </w:tc>
-        <w:tc>
-          <w:tcPr>
-            <w:tcW w:type="dxa" w:w="3372"/>
+              <w:t xml:space="preserve"/>
+            </w:r>
+          </w:p>
+        </w:tc>
+        <w:tc>
+          <w:tcPr>
+            <w:tcW w:type="dxa" w:w="2506"/>
             <w:tcBorders>
               <w:top w:val="single" w:color="E0E0E0" w:sz="4"/>
               <w:left w:val="single" w:color="E0E0E0" w:sz="4"/>
@@ -1248,7 +1759,75 @@
                 <w:sz w:val="20"/>
                 <w:szCs w:val="20"/>
               </w:rPr>
-              <w:t xml:space="preserve">Cuándo elegirías cada una</w:t>
+              <w:t xml:space="preserve">Instancia</w:t>
+            </w:r>
+          </w:p>
+        </w:tc>
+        <w:tc>
+          <w:tcPr>
+            <w:tcW w:type="dxa" w:w="2506"/>
+            <w:tcBorders>
+              <w:top w:val="single" w:color="E0E0E0" w:sz="4"/>
+              <w:left w:val="single" w:color="E0E0E0" w:sz="4"/>
+              <w:bottom w:val="single" w:color="E0E0E0" w:sz="4"/>
+              <w:right w:val="single" w:color="E0E0E0" w:sz="4"/>
+            </w:tcBorders>
+            <w:shd w:fill="3949AB" w:val="clear"/>
+            <w:tcMar>
+              <w:top w:type="dxa" w:w="100"/>
+              <w:left w:type="dxa" w:w="140"/>
+              <w:bottom w:type="dxa" w:w="100"/>
+              <w:right w:type="dxa" w:w="100"/>
+            </w:tcMar>
+          </w:tcPr>
+          <w:p>
+            <w:pPr>
+              <w:jc w:val="center"/>
+            </w:pPr>
+            <w:r>
+              <w:rPr>
+                <w:rFonts w:ascii="Arial" w:cs="Arial" w:eastAsia="Arial" w:hAnsi="Arial"/>
+                <w:b/>
+                <w:bCs/>
+                <w:color w:val="FFFFFF"/>
+                <w:sz w:val="20"/>
+                <w:szCs w:val="20"/>
+              </w:rPr>
+              <w:t xml:space="preserve">Contenedor gestionado</w:t>
+            </w:r>
+          </w:p>
+        </w:tc>
+        <w:tc>
+          <w:tcPr>
+            <w:tcW w:type="dxa" w:w="2506"/>
+            <w:tcBorders>
+              <w:top w:val="single" w:color="E0E0E0" w:sz="4"/>
+              <w:left w:val="single" w:color="E0E0E0" w:sz="4"/>
+              <w:bottom w:val="single" w:color="E0E0E0" w:sz="4"/>
+              <w:right w:val="single" w:color="E0E0E0" w:sz="4"/>
+            </w:tcBorders>
+            <w:shd w:fill="3949AB" w:val="clear"/>
+            <w:tcMar>
+              <w:top w:type="dxa" w:w="100"/>
+              <w:left w:type="dxa" w:w="140"/>
+              <w:bottom w:type="dxa" w:w="100"/>
+              <w:right w:type="dxa" w:w="100"/>
+            </w:tcMar>
+          </w:tcPr>
+          <w:p>
+            <w:pPr>
+              <w:jc w:val="center"/>
+            </w:pPr>
+            <w:r>
+              <w:rPr>
+                <w:rFonts w:ascii="Arial" w:cs="Arial" w:eastAsia="Arial" w:hAnsi="Arial"/>
+                <w:b/>
+                <w:bCs/>
+                <w:color w:val="FFFFFF"/>
+                <w:sz w:val="20"/>
+                <w:szCs w:val="20"/>
+              </w:rPr>
+              <w:t xml:space="preserve">Función</w:t>
             </w:r>
           </w:p>
         </w:tc>
@@ -1259,7 +1838,7 @@
         </w:trPr>
         <w:tc>
           <w:tcPr>
-            <w:tcW w:type="dxa" w:w="1928"/>
+            <w:tcW w:type="dxa" w:w="2120"/>
             <w:tcBorders>
               <w:top w:val="single" w:color="E0E0E0" w:sz="4"/>
               <w:left w:val="single" w:color="E0E0E0" w:sz="4"/>
@@ -1286,7 +1865,7 @@
         </w:tc>
         <w:tc>
           <w:tcPr>
-            <w:tcW w:type="dxa" w:w="1928"/>
+            <w:tcW w:type="dxa" w:w="2506"/>
             <w:tcBorders>
               <w:top w:val="single" w:color="E0E0E0" w:sz="4"/>
               <w:left w:val="single" w:color="E0E0E0" w:sz="4"/>
@@ -1313,7 +1892,7 @@
         </w:tc>
         <w:tc>
           <w:tcPr>
-            <w:tcW w:type="dxa" w:w="2410"/>
+            <w:tcW w:type="dxa" w:w="2506"/>
             <w:tcBorders>
               <w:top w:val="single" w:color="E0E0E0" w:sz="4"/>
               <w:left w:val="single" w:color="E0E0E0" w:sz="4"/>
@@ -1340,7 +1919,7 @@
         </w:tc>
         <w:tc>
           <w:tcPr>
-            <w:tcW w:type="dxa" w:w="3372"/>
+            <w:tcW w:type="dxa" w:w="2506"/>
             <w:tcBorders>
               <w:top w:val="single" w:color="E0E0E0" w:sz="4"/>
               <w:left w:val="single" w:color="E0E0E0" w:sz="4"/>
@@ -1372,7 +1951,7 @@
         </w:trPr>
         <w:tc>
           <w:tcPr>
-            <w:tcW w:type="dxa" w:w="1928"/>
+            <w:tcW w:type="dxa" w:w="2120"/>
             <w:tcBorders>
               <w:top w:val="single" w:color="E0E0E0" w:sz="4"/>
               <w:left w:val="single" w:color="E0E0E0" w:sz="4"/>
@@ -1399,7 +1978,7 @@
         </w:tc>
         <w:tc>
           <w:tcPr>
-            <w:tcW w:type="dxa" w:w="1928"/>
+            <w:tcW w:type="dxa" w:w="2506"/>
             <w:tcBorders>
               <w:top w:val="single" w:color="E0E0E0" w:sz="4"/>
               <w:left w:val="single" w:color="E0E0E0" w:sz="4"/>
@@ -1426,7 +2005,7 @@
         </w:tc>
         <w:tc>
           <w:tcPr>
-            <w:tcW w:type="dxa" w:w="2410"/>
+            <w:tcW w:type="dxa" w:w="2506"/>
             <w:tcBorders>
               <w:top w:val="single" w:color="E0E0E0" w:sz="4"/>
               <w:left w:val="single" w:color="E0E0E0" w:sz="4"/>
@@ -1453,7 +2032,7 @@
         </w:tc>
         <w:tc>
           <w:tcPr>
-            <w:tcW w:type="dxa" w:w="3372"/>
+            <w:tcW w:type="dxa" w:w="2506"/>
             <w:tcBorders>
               <w:top w:val="single" w:color="E0E0E0" w:sz="4"/>
               <w:left w:val="single" w:color="E0E0E0" w:sz="4"/>
@@ -1485,7 +2064,7 @@
         </w:trPr>
         <w:tc>
           <w:tcPr>
-            <w:tcW w:type="dxa" w:w="1928"/>
+            <w:tcW w:type="dxa" w:w="2120"/>
             <w:tcBorders>
               <w:top w:val="single" w:color="E0E0E0" w:sz="4"/>
               <w:left w:val="single" w:color="E0E0E0" w:sz="4"/>
@@ -1512,7 +2091,7 @@
         </w:tc>
         <w:tc>
           <w:tcPr>
-            <w:tcW w:type="dxa" w:w="1928"/>
+            <w:tcW w:type="dxa" w:w="2506"/>
             <w:tcBorders>
               <w:top w:val="single" w:color="E0E0E0" w:sz="4"/>
               <w:left w:val="single" w:color="E0E0E0" w:sz="4"/>
@@ -1539,7 +2118,7 @@
         </w:tc>
         <w:tc>
           <w:tcPr>
-            <w:tcW w:type="dxa" w:w="2410"/>
+            <w:tcW w:type="dxa" w:w="2506"/>
             <w:tcBorders>
               <w:top w:val="single" w:color="E0E0E0" w:sz="4"/>
               <w:left w:val="single" w:color="E0E0E0" w:sz="4"/>
@@ -1566,7 +2145,7 @@
         </w:tc>
         <w:tc>
           <w:tcPr>
-            <w:tcW w:type="dxa" w:w="3372"/>
+            <w:tcW w:type="dxa" w:w="2506"/>
             <w:tcBorders>
               <w:top w:val="single" w:color="E0E0E0" w:sz="4"/>
               <w:left w:val="single" w:color="E0E0E0" w:sz="4"/>
@@ -1579,6 +2158,282 @@
               <w:left w:type="dxa" w:w="140"/>
               <w:bottom w:type="dxa" w:w="80"/>
               <w:right w:type="dxa" w:w="100"/>
+            </w:tcMar>
+          </w:tcPr>
+          <w:p>
+            <w:r>
+              <w:rPr>
+                <w:sz w:val="22"/>
+                <w:szCs w:val="22"/>
+              </w:rPr>
+              <w:t xml:space="preserve"/>
+            </w:r>
+          </w:p>
+        </w:tc>
+      </w:tr>
+      <w:tr>
+        <w:trPr>
+          <w:trHeight w:val="800"/>
+        </w:trPr>
+        <w:tc>
+          <w:tcPr>
+            <w:tcW w:type="dxa" w:w="2120"/>
+            <w:tcBorders>
+              <w:top w:val="single" w:color="E0E0E0" w:sz="4"/>
+              <w:left w:val="single" w:color="E0E0E0" w:sz="4"/>
+              <w:bottom w:val="single" w:color="E0E0E0" w:sz="4"/>
+              <w:right w:val="single" w:color="E0E0E0" w:sz="4"/>
+            </w:tcBorders>
+            <w:shd w:fill="F5F5F5" w:val="clear"/>
+            <w:tcMar>
+              <w:top w:type="dxa" w:w="80"/>
+              <w:left w:type="dxa" w:w="140"/>
+              <w:bottom w:type="dxa" w:w="80"/>
+              <w:right w:type="dxa" w:w="100"/>
+            </w:tcMar>
+          </w:tcPr>
+          <w:p>
+            <w:r>
+              <w:rPr>
+                <w:sz w:val="22"/>
+                <w:szCs w:val="22"/>
+              </w:rPr>
+              <w:t xml:space="preserve"/>
+            </w:r>
+          </w:p>
+        </w:tc>
+        <w:tc>
+          <w:tcPr>
+            <w:tcW w:type="dxa" w:w="2506"/>
+            <w:tcBorders>
+              <w:top w:val="single" w:color="E0E0E0" w:sz="4"/>
+              <w:left w:val="single" w:color="E0E0E0" w:sz="4"/>
+              <w:bottom w:val="single" w:color="E0E0E0" w:sz="4"/>
+              <w:right w:val="single" w:color="E0E0E0" w:sz="4"/>
+            </w:tcBorders>
+            <w:shd w:fill="F5F5F5" w:val="clear"/>
+            <w:tcMar>
+              <w:top w:type="dxa" w:w="80"/>
+              <w:left w:type="dxa" w:w="140"/>
+              <w:bottom w:type="dxa" w:w="80"/>
+              <w:right w:type="dxa" w:w="100"/>
+            </w:tcMar>
+          </w:tcPr>
+          <w:p>
+            <w:r>
+              <w:rPr>
+                <w:sz w:val="22"/>
+                <w:szCs w:val="22"/>
+              </w:rPr>
+              <w:t xml:space="preserve"/>
+            </w:r>
+          </w:p>
+        </w:tc>
+        <w:tc>
+          <w:tcPr>
+            <w:tcW w:type="dxa" w:w="2506"/>
+            <w:tcBorders>
+              <w:top w:val="single" w:color="E0E0E0" w:sz="4"/>
+              <w:left w:val="single" w:color="E0E0E0" w:sz="4"/>
+              <w:bottom w:val="single" w:color="E0E0E0" w:sz="4"/>
+              <w:right w:val="single" w:color="E0E0E0" w:sz="4"/>
+            </w:tcBorders>
+            <w:shd w:fill="F5F5F5" w:val="clear"/>
+            <w:tcMar>
+              <w:top w:type="dxa" w:w="80"/>
+              <w:left w:type="dxa" w:w="140"/>
+              <w:bottom w:type="dxa" w:w="80"/>
+              <w:right w:type="dxa" w:w="100"/>
+            </w:tcMar>
+          </w:tcPr>
+          <w:p>
+            <w:r>
+              <w:rPr>
+                <w:sz w:val="22"/>
+                <w:szCs w:val="22"/>
+              </w:rPr>
+              <w:t xml:space="preserve"/>
+            </w:r>
+          </w:p>
+        </w:tc>
+        <w:tc>
+          <w:tcPr>
+            <w:tcW w:type="dxa" w:w="2506"/>
+            <w:tcBorders>
+              <w:top w:val="single" w:color="E0E0E0" w:sz="4"/>
+              <w:left w:val="single" w:color="E0E0E0" w:sz="4"/>
+              <w:bottom w:val="single" w:color="E0E0E0" w:sz="4"/>
+              <w:right w:val="single" w:color="E0E0E0" w:sz="4"/>
+            </w:tcBorders>
+            <w:shd w:fill="F5F5F5" w:val="clear"/>
+            <w:tcMar>
+              <w:top w:type="dxa" w:w="80"/>
+              <w:left w:type="dxa" w:w="140"/>
+              <w:bottom w:type="dxa" w:w="80"/>
+              <w:right w:type="dxa" w:w="100"/>
+            </w:tcMar>
+          </w:tcPr>
+          <w:p>
+            <w:r>
+              <w:rPr>
+                <w:sz w:val="22"/>
+                <w:szCs w:val="22"/>
+              </w:rPr>
+              <w:t xml:space="preserve"/>
+            </w:r>
+          </w:p>
+        </w:tc>
+      </w:tr>
+    </w:tbl>
+    <w:p>
+      <w:pPr>
+        <w:spacing w:after="160"/>
+      </w:pPr>
+    </w:p>
+    <w:p>
+      <w:pPr>
+        <w:spacing w:after="100"/>
+      </w:pPr>
+      <w:r>
+        <w:rPr>
+          <w:rFonts w:ascii="Arial" w:cs="Arial" w:eastAsia="Arial" w:hAnsi="Arial"/>
+          <w:color w:val="212121"/>
+          <w:sz w:val="22"/>
+          <w:szCs w:val="22"/>
+        </w:rPr>
+        <w:t xml:space="preserve">Tu recomendación razonada para el contador de asistencia:</w:t>
+      </w:r>
+    </w:p>
+    <w:tbl>
+      <w:tblPr>
+        <w:tblW w:type="dxa" w:w="9638"/>
+        <w:tblBorders>
+          <w:top w:val="single" w:color="auto" w:sz="4"/>
+          <w:left w:val="single" w:color="auto" w:sz="4"/>
+          <w:bottom w:val="single" w:color="auto" w:sz="4"/>
+          <w:right w:val="single" w:color="auto" w:sz="4"/>
+          <w:insideH w:val="single" w:color="auto" w:sz="4"/>
+          <w:insideV w:val="single" w:color="auto" w:sz="4"/>
+        </w:tblBorders>
+      </w:tblPr>
+      <w:tblGrid>
+        <w:gridCol w:w="9638"/>
+      </w:tblGrid>
+      <w:tr>
+        <w:trPr>
+          <w:trHeight w:val="480"/>
+        </w:trPr>
+        <w:tc>
+          <w:tcPr>
+            <w:tcW w:type="dxa" w:w="9638"/>
+            <w:tcBorders>
+              <w:top w:val="single" w:color="E0E0E0" w:sz="4"/>
+              <w:left w:val="single" w:color="E0E0E0" w:sz="4"/>
+              <w:bottom w:val="single" w:color="E0E0E0" w:sz="4"/>
+              <w:right w:val="single" w:color="E0E0E0" w:sz="4"/>
+            </w:tcBorders>
+            <w:shd w:fill="FAFAFA" w:val="clear"/>
+            <w:tcMar>
+              <w:top w:type="dxa" w:w="60"/>
+              <w:left w:type="dxa" w:w="160"/>
+              <w:bottom w:type="dxa" w:w="60"/>
+              <w:right w:type="dxa" w:w="160"/>
+            </w:tcMar>
+          </w:tcPr>
+          <w:p>
+            <w:r>
+              <w:rPr>
+                <w:sz w:val="22"/>
+                <w:szCs w:val="22"/>
+              </w:rPr>
+              <w:t xml:space="preserve"/>
+            </w:r>
+          </w:p>
+        </w:tc>
+      </w:tr>
+      <w:tr>
+        <w:trPr>
+          <w:trHeight w:val="480"/>
+        </w:trPr>
+        <w:tc>
+          <w:tcPr>
+            <w:tcW w:type="dxa" w:w="9638"/>
+            <w:tcBorders>
+              <w:top w:val="single" w:color="E0E0E0" w:sz="4"/>
+              <w:left w:val="single" w:color="E0E0E0" w:sz="4"/>
+              <w:bottom w:val="single" w:color="E0E0E0" w:sz="4"/>
+              <w:right w:val="single" w:color="E0E0E0" w:sz="4"/>
+            </w:tcBorders>
+            <w:shd w:fill="FAFAFA" w:val="clear"/>
+            <w:tcMar>
+              <w:top w:type="dxa" w:w="60"/>
+              <w:left w:type="dxa" w:w="160"/>
+              <w:bottom w:type="dxa" w:w="60"/>
+              <w:right w:type="dxa" w:w="160"/>
+            </w:tcMar>
+          </w:tcPr>
+          <w:p>
+            <w:r>
+              <w:rPr>
+                <w:sz w:val="22"/>
+                <w:szCs w:val="22"/>
+              </w:rPr>
+              <w:t xml:space="preserve"/>
+            </w:r>
+          </w:p>
+        </w:tc>
+      </w:tr>
+      <w:tr>
+        <w:trPr>
+          <w:trHeight w:val="480"/>
+        </w:trPr>
+        <w:tc>
+          <w:tcPr>
+            <w:tcW w:type="dxa" w:w="9638"/>
+            <w:tcBorders>
+              <w:top w:val="single" w:color="E0E0E0" w:sz="4"/>
+              <w:left w:val="single" w:color="E0E0E0" w:sz="4"/>
+              <w:bottom w:val="single" w:color="E0E0E0" w:sz="4"/>
+              <w:right w:val="single" w:color="E0E0E0" w:sz="4"/>
+            </w:tcBorders>
+            <w:shd w:fill="FAFAFA" w:val="clear"/>
+            <w:tcMar>
+              <w:top w:type="dxa" w:w="60"/>
+              <w:left w:type="dxa" w:w="160"/>
+              <w:bottom w:type="dxa" w:w="60"/>
+              <w:right w:type="dxa" w:w="160"/>
+            </w:tcMar>
+          </w:tcPr>
+          <w:p>
+            <w:r>
+              <w:rPr>
+                <w:sz w:val="22"/>
+                <w:szCs w:val="22"/>
+              </w:rPr>
+              <w:t xml:space="preserve"/>
+            </w:r>
+          </w:p>
+        </w:tc>
+      </w:tr>
+      <w:tr>
+        <w:trPr>
+          <w:trHeight w:val="480"/>
+        </w:trPr>
+        <w:tc>
+          <w:tcPr>
+            <w:tcW w:type="dxa" w:w="9638"/>
+            <w:tcBorders>
+              <w:top w:val="single" w:color="E0E0E0" w:sz="4"/>
+              <w:left w:val="single" w:color="E0E0E0" w:sz="4"/>
+              <w:bottom w:val="single" w:color="E0E0E0" w:sz="4"/>
+              <w:right w:val="single" w:color="E0E0E0" w:sz="4"/>
+            </w:tcBorders>
+            <w:shd w:fill="FAFAFA" w:val="clear"/>
+            <w:tcMar>
+              <w:top w:type="dxa" w:w="60"/>
+              <w:left w:type="dxa" w:w="160"/>
+              <w:bottom w:type="dxa" w:w="60"/>
+              <w:right w:type="dxa" w:w="160"/>
             </w:tcMar>
           </w:tcPr>
           <w:p>

</xml_diff>